<commit_message>
fix: add Indian Nursing Council verification route alongside Joint Commission PSV (HRM12)
5.1 already cites the Indian Nursing Council Act 1947 for identification,
but 5.3 (credential verification) relied solely on The Joint Commission's
primary-source-verification white paper. Added a note that the Indian
route is verification with the Indian/State Nursing Council, alongside
direct confirmation from the awarding institution.

Co-Authored-By: Claude Sonnet 5 <noreply@anthropic.com>
Claude-Session: https://claude.ai/code/session_01TPRLtLhmTCP5z94Q3FiE5v
</commit_message>
<xml_diff>
--- a/policies/build/chapters_v2/HRM/documents/HRM_Package_v2/HRM12/SOP_HRM12_credentialing_and_privileging_of_nursing_professionals.docx
+++ b/policies/build/chapters_v2/HRM/documents/HRM_Package_v2/HRM12/SOP_HRM12_credentialing_and_privileging_of_nursing_professionals.docx
@@ -321,34 +321,22 @@
     </w:p>
     <w:p>
       <w:r>
-        <w:t xml:space="preserve">HR In-Charge / Personnel Officer: </w:t>
-      </w:r>
-      <w:r>
-        <w:t>owns recruitment, training records, personal files and the day-to-day running of this policy, and keeps the required records current.</w:t>
+        <w:t xml:space="preserve">HR In-Charge / Personnel Officer: owns recruitment, training records, personal files and the day-to-day running of this policy, and keeps the required records current.</w:t>
       </w:r>
     </w:p>
     <w:p>
       <w:r>
-        <w:t xml:space="preserve">Medical Superintendent: </w:t>
-      </w:r>
-      <w:r>
-        <w:t>escalation point for any unresolved gap, and approves the workforce plan, contingency plan and credentialing/privileging decisions.</w:t>
+        <w:t xml:space="preserve">Medical Superintendent: escalation point for any unresolved gap, and approves the workforce plan, contingency plan and credentialing/privileging decisions.</w:t>
       </w:r>
     </w:p>
     <w:p>
       <w:r>
-        <w:t xml:space="preserve">Department Heads / Heads of Service: </w:t>
-      </w:r>
-      <w:r>
-        <w:t>identify their own department's staffing, training and credentialing needs, and support this policy's records at department level.</w:t>
+        <w:t xml:space="preserve">Department Heads / Heads of Service: identify their own department's staffing, training and credentialing needs, and support this policy's records at department level.</w:t>
       </w:r>
     </w:p>
     <w:p>
       <w:r>
-        <w:t xml:space="preserve">Quality Coordinator: </w:t>
-      </w:r>
-      <w:r>
-        <w:t>audits this policy periodically, checks records against the steps below, and flags gaps for corrective action.</w:t>
+        <w:t xml:space="preserve">Quality Coordinator: audits this policy periodically, checks records against the steps below, and flags gaps for corrective action.</w:t>
       </w:r>
     </w:p>
     <w:p>
@@ -541,6 +529,14 @@
           <w:t>The Joint Commission. Primary Source Verification (white paper).</w:t>
         </w:r>
       </w:hyperlink>
+    </w:p>
+    <w:p>
+      <w:pPr>
+        <w:pStyle w:val="ListParagraph"/>
+      </w:pPr>
+      <w:r>
+        <w:t>Note: The Joint Commission’s primary-source-verification concept is cited as a methodology reference, not as the verification route itself. In India, the operative primary-source check for a nurse’s qualification is verification of registration with the Indian Nursing Council / the relevant State Nursing Council under the Indian Nursing Council Act, 1947, alongside direct confirmation from the awarding institution.</w:t>
+      </w:r>
     </w:p>
     <w:p>
       <w:pPr>

</xml_diff>